<commit_message>
fix(templates): decision 1.5 gives the number of representatives as a minimum
H.G. 1425/2006 art. 53(2) sets the least number of representatives, as 2.2 and 11 quote it; the
decision read as an exact number, which made two representatives in a small unit look unlawful.

Claude-Session: https://claude.ai/code/session_01A9qjCHVH6kcDAEKFiJoShR
</commit_message>
<xml_diff>
--- a/packages/document-engine/templates/1.5_decision_workers_representative.docx
+++ b/packages/document-engine/templates/1.5_decision_workers_representative.docx
@@ -478,7 +478,7 @@
           <w:szCs w:val="20"/>
           <w:lang w:val="ro-RO"/>
         </w:rPr>
-        <w:t xml:space="preserve">un reprezentant, în cazul în care </w:t>
+        <w:t xml:space="preserve">cel puțin un reprezentant, în cazul în care </w:t>
       </w:r>
       <w:r>
         <w:rPr>
@@ -569,7 +569,7 @@
           <w:szCs w:val="20"/>
           <w:lang w:val="ro-RO"/>
         </w:rPr>
-        <w:t xml:space="preserve">doi reprezentanți, în cazul în care </w:t>
+        <w:t xml:space="preserve">cel puțin doi reprezentanți, în cazul în care </w:t>
       </w:r>
       <w:r>
         <w:rPr>

</xml_diff>

<commit_message>
fix(templates): the workers' representative decision sets the representative's role off with commas
The preamble reads "X, în calitate de …" and Art. 8 "X, având funcția de …
în cadrul …, începând cu data de…".

Claude-Session: https://claude.ai/code/session_01A9qjCHVH6kcDAEKFiJoShR
</commit_message>
<xml_diff>
--- a/packages/document-engine/templates/1.5_decision_workers_representative.docx
+++ b/packages/document-engine/templates/1.5_decision_workers_representative.docx
@@ -117,7 +117,7 @@
           <w:szCs w:val="20"/>
           <w:lang w:val="ro-RO"/>
         </w:rPr>
-        <w:t>tiveName}} în c</w:t>
+        <w:t xml:space="preserve">tiveName}}, în c</w:t>
       </w:r>
       <w:r>
         <w:rPr>
@@ -1124,7 +1124,7 @@
           <w:szCs w:val="20"/>
           <w:lang w:val="ro-RO"/>
         </w:rPr>
-        <w:t xml:space="preserve">tiveName}} având </w:t>
+        <w:t xml:space="preserve">tiveName}}, având </w:t>
       </w:r>
       <w:r>
         <w:rPr>

</xml_diff>